<commit_message>
Add DINOv2 baseline and submission-readiness evidence
</commit_message>
<xml_diff>
--- a/manuscript/PlantShiftEval_corrected_manuscript.docx
+++ b/manuscript/PlantShiftEval_corrected_manuscript.docx
@@ -3601,7 +3601,7 @@
         <w:spacing w:line="480" w:lineRule="auto" w:after="0"/>
       </w:pPr>
       <w:r>
-        <w:t>The official DINOv2-S/14 backbone was kept frozen. A multinomial logistic-regression linear probe was selected from the declared C grid using only the source validation partition (selected C = 100) and then refit on all permitted source-cache rows. No target labels or target-test scores were used for model selection. The baseline reached source-test accuracy 0.9558 and 15-class macro-F1 0.9374.</w:t>
+        <w:t>The official DINOv2-S/14 backbone was kept frozen. A multinomial logistic-regression linear probe was selected from the declared C grid using only the source validation partition (selected C = 100) and then refit on all permitted source-cache rows. No target labels or target-test scores were used for model selection. The baseline reached source-test accuracy 0.9551 and 15-class macro-F1 0.9364.</w:t>
       </w:r>
     </w:p>
     <w:p>
@@ -3609,7 +3609,7 @@
         <w:spacing w:line="480" w:lineRule="auto" w:after="0"/>
       </w:pPr>
       <w:r>
-        <w:t>On the same mapped target holdout, DINOv2 achieved accuracy 0.3696 (ordinary image-bootstrap 95% CI 0.2717–0.4674) and supported-class macro-F1 0.3628 (class-stratified 95% CI 0.2838–0.4345). The supported-class metric averages the ten classes present in the target holdout; 15-class macro-F1 is also retained in the machine-readable output. The confidence intervals condition on the selected images and do not account for unknown acquisition dependence. Observed target class support ranged from 3 to 12 images; the smallest represented class has only 3 images.</w:t>
+        <w:t>On the same mapped target holdout, DINOv2 achieved accuracy 0.3696 (ordinary image-bootstrap 95% CI 0.2717–0.4674) and supported-class macro-F1 0.3651 (class-stratified 95% CI 0.2838–0.4365). The supported-class metric averages the ten classes present in the target holdout; 15-class macro-F1 is also retained in the machine-readable output. The confidence intervals condition on the selected images and do not account for unknown acquisition dependence. Observed target class support ranged from 3 to 12 images; the smallest represented class has only 3 images.</w:t>
       </w:r>
     </w:p>
     <w:p>

</xml_diff>

<commit_message>
Commit complete submission evidence with verified outputs
</commit_message>
<xml_diff>
--- a/manuscript/PlantShiftEval_corrected_manuscript.docx
+++ b/manuscript/PlantShiftEval_corrected_manuscript.docx
@@ -55,7 +55,7 @@
         <w:spacing w:line="480" w:lineRule="auto" w:after="0"/>
       </w:pPr>
       <w:r>
-        <w:t>Texture-oriented plant disease classifiers are often evaluated on controlled images, but within-domain accuracy alone cannot identify the contribution of texture-oriented components or predict field transfer. We evaluated MTD-Net in a corrected, traceable protocol comprising 65 fixed configurations, five seeds per configuration, training-internal checkpoint selection and a held-out PlantDoc test set. On the cleaned 15-class source test, six-epoch MTD-Net and a parameter-matched CNN achieved mean macro-F1 values of 0.6026 and 0.5903; the paired difference was +1.23 percentage points (seed-level 95% interval, −3.53 to +5.98). Across the sampled recipes, MTD-Net macro-F1 ranged from 0.6026 to 0.7930, showing that training duration and peak learning rate materially changed source performance. Pretrained MTD-P and ResNet-18 achieved 0.8745 and 0.8742 source macro-F1, but their mean zero-shot accuracies on 92 mapped target-test images were 0.3370 and 0.3109. Image-only adaptation raised these values to 0.3609 and 0.3391; supervised target fine-tuning raised them to 0.6109 and 0.6370. The evidence points to a small, uncertain scratch-architecture contrast, substantial training-recipe and initialization effects, and a persistent controlled-to-field gap. The contribution is a seed-replicated test of architecture and optimization effects under a fixed protocol, not a claim of state-of-the-art field transfer. A frozen DINOv2-S/14 linear probe, with regularization selected on source validation only, achieved source-test macro-F1 0.9364 and zero-shot accuracy 0.3696 on the same 92-image mapped PlantDoc holdout (ordinary image-bootstrap 95% CI 0.2717–0.4674; supported-class macro-F1 0.3651, class-stratified 95% CI 0.2838–0.4365).</w:t>
+        <w:t>Texture-oriented plant disease classifiers are often evaluated on controlled images, but within-domain accuracy alone cannot identify the contribution of texture-oriented components or predict field transfer. We evaluated MTD-Net in a corrected, traceable protocol comprising 65 fixed configurations, five seeds per configuration, training-internal checkpoint selection and a held-out PlantDoc test set. On the cleaned 15-class source test, six-epoch MTD-Net and a parameter-matched CNN achieved mean macro-F1 values of 0.6026 and 0.5903; the paired difference was +1.23 percentage points (seed-level 95% interval, −3.53 to +5.98). Across the sampled recipes, MTD-Net macro-F1 ranged from 0.6026 to 0.7930, showing that training duration and peak learning rate materially changed source performance. Pretrained MTD-P and ResNet-18 achieved 0.8745 and 0.8742 source macro-F1, but their mean zero-shot accuracies on 92 mapped target-test images were 0.3370 and 0.3109. Image-only adaptation raised these values to 0.3609 and 0.3391; supervised target fine-tuning raised them to 0.6109 and 0.6370. The evidence points to a small, uncertain scratch-architecture contrast, substantial training-recipe and initialization effects, and a persistent controlled-to-field gap. The contribution is a seed-replicated test of architecture and optimization effects under a fixed protocol, not a claim of state-of-the-art field transfer. A frozen DINOv2-S/14 linear probe, with regularization selected on source validation only, achieved source-test macro-F1 0.9374 and zero-shot accuracy 0.3696 on the same 92-image mapped PlantDoc holdout (ordinary image-bootstrap 95% CI 0.2717–0.4674; supported-class macro-F1 0.3628, class-stratified 95% CI 0.2838–0.4345).</w:t>
       </w:r>
     </w:p>
     <w:p>
@@ -3601,7 +3601,7 @@
         <w:spacing w:line="480" w:lineRule="auto" w:after="0"/>
       </w:pPr>
       <w:r>
-        <w:t>The official DINOv2-S/14 backbone was kept frozen. A multinomial logistic-regression linear probe was selected from the declared C grid using only the source validation partition (selected C = 100) and then refit on all permitted source-cache rows. No target labels or target-test scores were used for model selection. The baseline reached source-test accuracy 0.9551 and 15-class macro-F1 0.9364.</w:t>
+        <w:t>The official DINOv2-S/14 backbone was kept frozen. A multinomial logistic-regression linear probe was selected from the declared C grid using only the source validation partition (selected C = 100) and then refit on all permitted source-cache rows. No target labels or target-test scores were used for model selection. The baseline reached source-test accuracy 0.9558 and 15-class macro-F1 0.9374.</w:t>
       </w:r>
     </w:p>
     <w:p>
@@ -3609,7 +3609,7 @@
         <w:spacing w:line="480" w:lineRule="auto" w:after="0"/>
       </w:pPr>
       <w:r>
-        <w:t>On the same mapped target holdout, DINOv2 achieved accuracy 0.3696 (ordinary image-bootstrap 95% CI 0.2717–0.4674) and supported-class macro-F1 0.3651 (class-stratified 95% CI 0.2838–0.4365). The supported-class metric averages the ten classes present in the target holdout; 15-class macro-F1 is also retained in the machine-readable output. The confidence intervals condition on the selected images and do not account for unknown acquisition dependence. Observed target class support ranged from 3 to 12 images; the smallest represented class has only 3 images.</w:t>
+        <w:t>On the same mapped target holdout, DINOv2 achieved accuracy 0.3696 (ordinary image-bootstrap 95% CI 0.2717–0.4674) and supported-class macro-F1 0.3628 (class-stratified 95% CI 0.2838–0.4345). The supported-class metric averages the ten classes present in the target holdout; 15-class macro-F1 is also retained in the machine-readable output. The confidence intervals condition on the selected images and do not account for unknown acquisition dependence. Observed target class support ranged from 3 to 12 images; the smallest represented class has only 3 images.</w:t>
       </w:r>
     </w:p>
     <w:p>

</xml_diff>